<commit_message>
Update Fable 5 doc: replace book-a-call CTA with Hermes Agent + Claude Mythos section
</commit_message>
<xml_diff>
--- a/fable5-use-cases.docx
+++ b/fable5-use-cases.docx
@@ -3465,7 +3465,7 @@
                 <w:sz w:val="36"/>
                 <w:color w:val="FFD700"/>
               </w:rPr>
-              <w:t>WANT A PERSONALISED FABLE 5 SETUP?</w:t>
+              <w:t>ALL MY AUTOMATIONS LIVE INSIDE HERMES</w:t>
             </w:r>
           </w:p>
           <w:p>
@@ -3477,7 +3477,7 @@
                 <w:sz w:val="22"/>
                 <w:color w:val="CCBBEE"/>
               </w:rPr>
-              <w:t>1-on-1 sessions available — we build your stack together</w:t>
+              <w:t>The self-evolving AI agent — supercharged with Claude Mythos</w:t>
             </w:r>
           </w:p>
         </w:tc>
@@ -3496,7 +3496,22 @@
           <w:color w:val="0D0D0D"/>
           <w:sz w:val="22"/>
         </w:rPr>
-        <w:t>I run personalised 1-on-1 strategy sessions where we deploy Fable 5 for your exact use case — whether that's a trading bot for your portfolio, an AI content engine for your brand, or a full-stack product built solo. Book a session below or reach out directly.</w:t>
+        <w:t>Every workflow in this guide runs inside Hermes — my agentic OS at www.myhermes.cloud. Hermes is a self-evolving AI agent that learns your preferences, remembers every session, and builds on its own knowledge over time. Paired with Claude Mythos, it becomes the most powerful personal AI stack available today.</w:t>
+      </w:r>
+    </w:p>
+    <w:p>
+      <w:pPr>
+        <w:spacing w:before="120" w:after="80"/>
+        <w:jc w:val="left"/>
+      </w:pPr>
+      <w:r>
+        <w:rPr>
+          <w:b w:val="0"/>
+          <w:i w:val="0"/>
+          <w:color w:val="0D0D0D"/>
+          <w:sz w:val="22"/>
+        </w:rPr>
+        <w:t>Trading bots, content pipelines, product ad generators, full-stack apps — they're all deployed and managed from a single terminal. No switching between tools. No lost context. Everything in one place, always running.</w:t>
       </w:r>
     </w:p>
     <w:p>
@@ -3510,7 +3525,148 @@
           <w:color w:val="5B21B6"/>
           <w:sz w:val="26"/>
         </w:rPr>
-        <w:t>Book a Personalised Session</w:t>
+        <w:t>Get Access to the Full Stack</w:t>
+      </w:r>
+    </w:p>
+    <w:tbl>
+      <w:tblPr>
+        <w:tblW w:type="auto" w:w="0"/>
+        <w:jc w:val="left"/>
+        <w:tblLook w:firstColumn="1" w:firstRow="1" w:lastColumn="0" w:lastRow="0" w:noHBand="0" w:noVBand="1" w:val="04A0"/>
+        <w:tblBorders>
+          <w:top w:val="none"/>
+          <w:left w:val="none"/>
+          <w:bottom w:val="none"/>
+          <w:right w:val="none"/>
+          <w:insideH w:val="none"/>
+          <w:insideV w:val="none"/>
+        </w:tblBorders>
+      </w:tblPr>
+      <w:tblGrid>
+        <w:gridCol w:w="9648"/>
+      </w:tblGrid>
+      <w:tr>
+        <w:tc>
+          <w:tcPr>
+            <w:tcW w:type="dxa" w:w="9648"/>
+            <w:shd w:val="clear" w:color="auto" w:fill="F3F0FF"/>
+            <w:tcMar>
+              <w:top w:w="120" w:type="dxa"/>
+              <w:bottom w:w="120" w:type="dxa"/>
+              <w:left w:w="180" w:type="dxa"/>
+              <w:right w:w="180" w:type="dxa"/>
+            </w:tcMar>
+          </w:tcPr>
+          <w:p>
+            <w:r>
+              <w:rPr>
+                <w:b/>
+                <w:sz w:val="24"/>
+                <w:color w:val="5B21B6"/>
+              </w:rPr>
+              <w:t>What Lives Inside Hermes</w:t>
+            </w:r>
+          </w:p>
+          <w:p>
+            <w:r>
+              <w:rPr>
+                <w:sz w:val="20"/>
+                <w:color w:val="333355"/>
+              </w:rPr>
+              <w:t xml:space="preserve">  •  Hermes Agent  — self-evolving, persistent memory across all sessions</w:t>
+            </w:r>
+          </w:p>
+          <w:p>
+            <w:r>
+              <w:rPr>
+                <w:sz w:val="20"/>
+                <w:color w:val="333355"/>
+              </w:rPr>
+              <w:t xml:space="preserve">  •  Claude Mythos  — Anthropic's reasoning model, deeply integrated</w:t>
+            </w:r>
+          </w:p>
+          <w:p>
+            <w:r>
+              <w:rPr>
+                <w:sz w:val="20"/>
+                <w:color w:val="333355"/>
+              </w:rPr>
+              <w:t xml:space="preserve">  •  MCP layer  — Hyperliquid · TradingView · GitHub · Vercel · and more</w:t>
+            </w:r>
+          </w:p>
+          <w:p>
+            <w:r>
+              <w:rPr>
+                <w:sz w:val="20"/>
+                <w:color w:val="333355"/>
+              </w:rPr>
+              <w:t xml:space="preserve">  •  Autonomous workflows  — trading bots, content engines, dev pipelines</w:t>
+            </w:r>
+          </w:p>
+          <w:p>
+            <w:r>
+              <w:rPr>
+                <w:sz w:val="20"/>
+                <w:color w:val="333355"/>
+              </w:rPr>
+              <w:t xml:space="preserve">  •  Prompt library  — every template from this guide, pre-loaded and ready</w:t>
+            </w:r>
+          </w:p>
+        </w:tc>
+      </w:tr>
+    </w:tbl>
+    <w:p/>
+    <w:p>
+      <w:pPr>
+        <w:spacing w:before="120" w:after="80"/>
+        <w:jc w:val="left"/>
+      </w:pPr>
+      <w:r>
+        <w:rPr>
+          <w:b/>
+          <w:color w:val="0D0D0D"/>
+          <w:sz w:val="22"/>
+        </w:rPr>
+        <w:t xml:space="preserve">→  Start here: </w:t>
+      </w:r>
+      <w:hyperlink r:id="rId14">
+        <w:r>
+          <w:rPr>
+            <w:color w:val="5B21B6"/>
+            <w:u w:val="single"/>
+            <w:sz w:val="22"/>
+          </w:rPr>
+          <w:t xml:space="preserve">www.myhermes.cloud</w:t>
+        </w:r>
+      </w:hyperlink>
+    </w:p>
+    <w:p>
+      <w:pPr>
+        <w:spacing w:before="240" w:after="120"/>
+        <w:jc w:val="left"/>
+      </w:pPr>
+      <w:r>
+        <w:rPr>
+          <w:b/>
+          <w:color w:val="5B21B6"/>
+          <w:sz w:val="26"/>
+        </w:rPr>
+        <w:t>Want a Personalised Setup?</w:t>
+      </w:r>
+    </w:p>
+    <w:p>
+      <w:pPr>
+        <w:spacing w:before="40" w:after="80"/>
+        <w:jc w:val="left"/>
+      </w:pPr>
+      <w:r>
+        <w:rPr>
+          <w:b w:val="0"/>
+          <w:i w:val="0"/>
+          <w:color w:val="0D0D0D"/>
+          <w:sz w:val="22"/>
+        </w:rPr>
+        <w:t>If you want me to configure Hermes + Fable 5 for your exact workflow — drop your details below and I'll reach out directly.</w:t>
       </w:r>
     </w:p>
     <w:p>
@@ -3523,16 +3679,16 @@
           <w:color w:val="0D0D0D"/>
           <w:sz w:val="22"/>
         </w:rPr>
-        <w:t xml:space="preserve">→  Fill in the form: </w:t>
+        <w:t xml:space="preserve">→  Request a personalised session: </w:t>
       </w:r>
-      <w:hyperlink r:id="rId14">
+      <w:hyperlink r:id="rId15">
         <w:r>
           <w:rPr>
             <w:color w:val="5B21B6"/>
             <w:u w:val="single"/>
             <w:sz w:val="22"/>
           </w:rPr>
-          <w:t xml:space="preserve">Click here to request your 1-on-1 session</w:t>
+          <w:t xml:space="preserve">Click here to submit your details</w:t>
         </w:r>
       </w:hyperlink>
     </w:p>

</xml_diff>